<commit_message>
docs: add scheduling decision guide and reorder workflow guides (#10593)
* docs: add scheduling guide, workflow ordering, and agent rule correction

Signed-off-by: Everett Williams <everett@medplum.com>

* [autofix.ci] apply automated fixes

* docs: link scheduling overview to decision guide

Signed-off-by: Everett Williams <everett@medplum.com>

* docs: address scheduling guide review feedback

Signed-off-by: Everett Williams <everett@medplum.com>

* [autofix.ci] apply automated fixes

* docs: update scheduling guide for atomic rescheduling

Signed-off-by: Everett Williams <everett@medplum.com>

---------

Signed-off-by: Everett Williams <everett@medplum.com>
Co-authored-by: autofix-ci[bot] <114827586+autofix-ci[bot]@users.noreply.github.com>
Co-authored-by: Karl Pietrzak <karl@medplum.com>
</commit_message>
<xml_diff>
--- a/packages/docs/static/decision-guides/charting.docx
+++ b/packages/docs/static/decision-guides/charting.docx
@@ -49,7 +49,7 @@
         </w:drawing>
       </w:r>
     </w:p>
-    <w:bookmarkStart w:id="39" w:name="charting-decision-guide"/>
+    <w:bookmarkStart w:id="40" w:name="charting-decision-guide"/>
     <w:p>
       <w:pPr>
         <w:pStyle w:val="Heading1"/>
@@ -443,7 +443,7 @@
     </w:p>
     <w:bookmarkEnd w:id="30"/>
     <w:bookmarkEnd w:id="31"/>
-    <w:bookmarkStart w:id="38" w:name="section-2-key-decisions"/>
+    <w:bookmarkStart w:id="39" w:name="section-2-key-decisions"/>
     <w:p>
       <w:pPr>
         <w:pStyle w:val="Heading2"/>
@@ -452,7 +452,7 @@
         <w:t xml:space="preserve">Section 2: Key Decisions</w:t>
       </w:r>
     </w:p>
-    <w:bookmarkStart w:id="32" w:name="X5867a1e1c3a7e9a9e7812a99386f911286d4d65"/>
+    <w:bookmarkStart w:id="33" w:name="X5867a1e1c3a7e9a9e7812a99386f911286d4d65"/>
     <w:p>
       <w:pPr>
         <w:pStyle w:val="Heading3"/>
@@ -499,22 +499,21 @@
         <w:t xml:space="preserve"> </w:t>
       </w:r>
       <w:r>
-        <w:t xml:space="preserve">A Visit Template links to a HealthcareService by</w:t>
+        <w:t xml:space="preserve">Define the mapping between charting Visit Templates and bookable HealthcareService offerings. Scheduling operations use explicit HealthcareService references, not code matching alone. See the</w:t>
       </w:r>
       <w:r>
         <w:t xml:space="preserve"> </w:t>
       </w:r>
-      <w:r>
-        <w:rPr>
-          <w:rStyle w:val="VerbatimChar"/>
-        </w:rPr>
-        <w:t xml:space="preserve">serviceType</w:t>
-      </w:r>
-      <w:r>
-        <w:t xml:space="preserve"> </w:t>
-      </w:r>
-      <w:r>
-        <w:t xml:space="preserve">code — the same code that drives scheduling. See the Scheduling Discovery and Decision Guide.</w:t>
+      <w:hyperlink r:id="rId32">
+        <w:r>
+          <w:rPr>
+            <w:rStyle w:val="Hyperlink"/>
+          </w:rPr>
+          <w:t xml:space="preserve">Scheduling Decision Guide</w:t>
+        </w:r>
+      </w:hyperlink>
+      <w:r>
+        <w:t xml:space="preserve">.</w:t>
       </w:r>
     </w:p>
     <w:p>
@@ -872,8 +871,8 @@
         </w:pict>
       </w:r>
     </w:p>
-    <w:bookmarkEnd w:id="32"/>
-    <w:bookmarkStart w:id="34" w:name="how-structured-should-the-chart-be"/>
+    <w:bookmarkEnd w:id="33"/>
+    <w:bookmarkStart w:id="35" w:name="how-structured-should-the-chart-be"/>
     <w:p>
       <w:pPr>
         <w:pStyle w:val="Heading3"/>
@@ -902,7 +901,7 @@
       <w:r>
         <w:t xml:space="preserve"> </w:t>
       </w:r>
-      <w:hyperlink r:id="rId33">
+      <w:hyperlink r:id="rId34">
         <w:r>
           <w:rPr>
             <w:rStyle w:val="Hyperlink"/>
@@ -1137,8 +1136,8 @@
         </w:pict>
       </w:r>
     </w:p>
-    <w:bookmarkEnd w:id="34"/>
-    <w:bookmarkStart w:id="35" w:name="X5adc9c6238bb5dfd2d9d53b6e8f4a256fd3b32d"/>
+    <w:bookmarkEnd w:id="35"/>
+    <w:bookmarkStart w:id="36" w:name="X5adc9c6238bb5dfd2d9d53b6e8f4a256fd3b32d"/>
     <w:p>
       <w:pPr>
         <w:pStyle w:val="Heading3"/>
@@ -1379,8 +1378,8 @@
         </w:pict>
       </w:r>
     </w:p>
-    <w:bookmarkEnd w:id="35"/>
-    <w:bookmarkStart w:id="36" w:name="what-are-the-signing-requirements"/>
+    <w:bookmarkEnd w:id="36"/>
+    <w:bookmarkStart w:id="37" w:name="what-are-the-signing-requirements"/>
     <w:p>
       <w:pPr>
         <w:pStyle w:val="Heading3"/>
@@ -1703,8 +1702,8 @@
         </w:pict>
       </w:r>
     </w:p>
-    <w:bookmarkEnd w:id="36"/>
-    <w:bookmarkStart w:id="37" w:name="who-owns-and-edits-visit-templates"/>
+    <w:bookmarkEnd w:id="37"/>
+    <w:bookmarkStart w:id="38" w:name="who-owns-and-edits-visit-templates"/>
     <w:p>
       <w:pPr>
         <w:pStyle w:val="Heading3"/>
@@ -1892,9 +1891,9 @@
         </w:tc>
       </w:tr>
     </w:tbl>
-    <w:bookmarkEnd w:id="37"/>
     <w:bookmarkEnd w:id="38"/>
     <w:bookmarkEnd w:id="39"/>
+    <w:bookmarkEnd w:id="40"/>
     <w:p/>
     <w:sectPr>
       <w:pgSz w:h="15840" w:w="12240"/>

</xml_diff>